<commit_message>
Normalizar fichas reto 2ESO (S01 Misión LED, S02 El botón de la verdad)
</commit_message>
<xml_diff>
--- a/2ESO/S02-el-boton-de-la-verdad/ficha-reto.docx
+++ b/2ESO/S02-el-boton-de-la-verdad/ficha-reto.docx
@@ -510,7 +510,7 @@
           <w:sz w:val="22"/>
           <w:szCs w:val="22"/>
         </w:rPr>
-        <w:t xml:space="preserve">El bloque IF en Arduino ejecuta código solo si la condición es verdadera. Aquí la condición es leer el estado del pulsador con digitalRead().</w:t>
+        <w:t xml:space="preserve">El bloque IF en Arduino ejecuta código solo si la condición es verdadera. Aquí la condición es leer el estado del pulsador con digitalRead(). Sin una resistencia pull-down, el pin flota entre 0 y 1 aleatoriamente cuando el botón está abierto.</w:t>
       </w:r>
     </w:p>
     <w:p>
@@ -841,7 +841,7 @@
           <w:sz w:val="22"/>
           <w:szCs w:val="22"/>
         </w:rPr>
-        <w:t xml:space="preserve">Completa la tabla antes de montar el circuito en Tinkercad:</w:t>
+        <w:t xml:space="preserve">Completa la tabla antes de montar el circuito:</w:t>
       </w:r>
     </w:p>
     <w:p>
@@ -1229,7 +1229,7 @@
                 <w:sz w:val="20"/>
                 <w:szCs w:val="20"/>
               </w:rPr>
-              <w:t xml:space="preserve">🔗 Resistencia en serie</w:t>
+              <w:t xml:space="preserve">🔗 Resistencia en serie LED</w:t>
             </w:r>
           </w:p>
         </w:tc>
@@ -1475,7 +1475,7 @@
           <w:sz w:val="22"/>
           <w:szCs w:val="22"/>
         </w:rPr>
-        <w:t xml:space="preserve">Abre Tinkercad Circuits y monta el circuito (pulsador pin 7 + LED pin 13). Luego escribe este código:</w:t>
+        <w:t xml:space="preserve">Monta el circuito (pulsador pin 7 con pull-down 10 kΩ + LED pin 13 con 220 Ω) y escribe este código:</w:t>
       </w:r>
     </w:p>
     <w:p>
@@ -1849,7 +1849,7 @@
           <w:sz w:val="22"/>
           <w:szCs w:val="22"/>
         </w:rPr>
-        <w:t xml:space="preserve">Ahora el LED enciende al pulsar pero no se apaga al soltar. Añade una segunda rama: usa un IF-ELSE para que cuando el botón esté en LOW el LED también se apague. Adelántate a S03 y consulta la sintaxis de if-else en Arduino.</w:t>
+        <w:t xml:space="preserve">El LED enciende al pulsar pero no se apaga al soltar. Añade la rama ELSE para que el LED se apague cuando el botón esté en LOW. Adelántate a S03 e investiga la sintaxis if-else en Arduino.</w:t>
       </w:r>
     </w:p>
     <w:p>
@@ -1880,12 +1880,12 @@
           <w:tcPr>
             <w:tcW w:type="dxa" w:w="9638"/>
             <w:tcBorders>
-              <w:top w:val="single" w:color="34D399" w:sz="2"/>
-              <w:left w:val="single" w:color="34D399" w:sz="2"/>
-              <w:bottom w:val="single" w:color="34D399" w:sz="2"/>
-              <w:right w:val="single" w:color="34D399" w:sz="2"/>
-            </w:tcBorders>
-            <w:shd w:fill="F0FFF8" w:val="clear"/>
+              <w:top w:val="single" w:color="4F46E5" w:sz="2"/>
+              <w:left w:val="single" w:color="4F46E5" w:sz="2"/>
+              <w:bottom w:val="single" w:color="4F46E5" w:sz="2"/>
+              <w:right w:val="single" w:color="4F46E5" w:sz="2"/>
+            </w:tcBorders>
+            <w:shd w:fill="EEF2FF" w:val="clear"/>
             <w:tcMar>
               <w:top w:type="dxa" w:w="100"/>
               <w:left w:type="dxa" w:w="200"/>
@@ -1897,7 +1897,7 @@
             <w:r>
               <w:rPr>
                 <w:rFonts w:ascii="Courier New" w:cs="Courier New" w:eastAsia="Courier New" w:hAnsi="Courier New"/>
-                <w:color w:val="2A5A2A"/>
+                <w:color w:val="312E81"/>
                 <w:sz w:val="19"/>
                 <w:szCs w:val="19"/>
               </w:rPr>
@@ -1908,7 +1908,7 @@
             <w:r>
               <w:rPr>
                 <w:rFonts w:ascii="Courier New" w:cs="Courier New" w:eastAsia="Courier New" w:hAnsi="Courier New"/>
-                <w:color w:val="2A5A2A"/>
+                <w:color w:val="312E81"/>
                 <w:sz w:val="19"/>
                 <w:szCs w:val="19"/>
               </w:rPr>
@@ -1919,7 +1919,7 @@
             <w:r>
               <w:rPr>
                 <w:rFonts w:ascii="Courier New" w:cs="Courier New" w:eastAsia="Courier New" w:hAnsi="Courier New"/>
-                <w:color w:val="2A5A2A"/>
+                <w:color w:val="312E81"/>
                 <w:sz w:val="19"/>
                 <w:szCs w:val="19"/>
               </w:rPr>
@@ -1930,7 +1930,7 @@
             <w:r>
               <w:rPr>
                 <w:rFonts w:ascii="Courier New" w:cs="Courier New" w:eastAsia="Courier New" w:hAnsi="Courier New"/>
-                <w:color w:val="2A5A2A"/>
+                <w:color w:val="312E81"/>
                 <w:sz w:val="19"/>
                 <w:szCs w:val="19"/>
               </w:rPr>
@@ -1941,21 +1941,32 @@
             <w:r>
               <w:rPr>
                 <w:rFonts w:ascii="Courier New" w:cs="Courier New" w:eastAsia="Courier New" w:hAnsi="Courier New"/>
-                <w:color w:val="2A5A2A"/>
+                <w:color w:val="312E81"/>
                 <w:sz w:val="19"/>
                 <w:szCs w:val="19"/>
               </w:rPr>
-              <w:t xml:space="preserve">        // ¿Qué pondrías aquí?</w:t>
+              <w:t xml:space="preserve">        // ¿Qué pondrías aquí para apagar el LED?</w:t>
             </w:r>
           </w:p>
           <w:p>
             <w:r>
               <w:rPr>
                 <w:rFonts w:ascii="Courier New" w:cs="Courier New" w:eastAsia="Courier New" w:hAnsi="Courier New"/>
-                <w:color w:val="2A5A2A"/>
+                <w:color w:val="312E81"/>
                 <w:sz w:val="19"/>
                 <w:szCs w:val="19"/>
               </w:rPr>
+              <w:t xml:space="preserve">        digitalWrite(pinLed, ???);</w:t>
+            </w:r>
+          </w:p>
+          <w:p>
+            <w:r>
+              <w:rPr>
+                <w:rFonts w:ascii="Courier New" w:cs="Courier New" w:eastAsia="Courier New" w:hAnsi="Courier New"/>
+                <w:color w:val="312E81"/>
+                <w:sz w:val="19"/>
+                <w:szCs w:val="19"/>
+              </w:rPr>
               <w:t xml:space="preserve">    }</w:t>
             </w:r>
           </w:p>
@@ -1963,7 +1974,7 @@
             <w:r>
               <w:rPr>
                 <w:rFonts w:ascii="Courier New" w:cs="Courier New" w:eastAsia="Courier New" w:hAnsi="Courier New"/>
-                <w:color w:val="2A5A2A"/>
+                <w:color w:val="312E81"/>
                 <w:sz w:val="19"/>
                 <w:szCs w:val="19"/>
               </w:rPr>

</xml_diff>

<commit_message>
Actualizar S02 2ESO: IF simple → IF-ELSE completo (LED ON/OFF con botón)
</commit_message>
<xml_diff>
--- a/2ESO/S02-el-boton-de-la-verdad/ficha-reto.docx
+++ b/2ESO/S02-el-boton-de-la-verdad/ficha-reto.docx
@@ -125,7 +125,7 @@
                 <w:sz w:val="20"/>
                 <w:szCs w:val="20"/>
               </w:rPr>
-              <w:t xml:space="preserve">IF</w:t>
+              <w:t xml:space="preserve">IF-ELSE</w:t>
             </w:r>
           </w:p>
           <w:p>
@@ -486,7 +486,7 @@
                 <w:sz w:val="24"/>
                 <w:szCs w:val="24"/>
               </w:rPr>
-              <w:t xml:space="preserve">🧠  ENTENDER — IF con entrada digital</w:t>
+              <w:t xml:space="preserve">🧠  ENTENDER — IF-ELSE con entrada digital</w:t>
             </w:r>
           </w:p>
         </w:tc>
@@ -510,7 +510,7 @@
           <w:sz w:val="22"/>
           <w:szCs w:val="22"/>
         </w:rPr>
-        <w:t xml:space="preserve">El bloque IF en Arduino ejecuta código solo si la condición es verdadera. Aquí la condición es leer el estado del pulsador con digitalRead(). Sin una resistencia pull-down, el pin flota entre 0 y 1 aleatoriamente cuando el botón está abierto.</w:t>
+        <w:t xml:space="preserve">El IF-ELSE garantiza que el programa siempre ejecuta algo: si la condición es verdadera ejecuta el IF; si es falsa ejecuta el ELSE. El LED siempre refleja el estado real del botón.</w:t>
       </w:r>
     </w:p>
     <w:p>
@@ -547,7 +547,7 @@
           <w:sz w:val="21"/>
           <w:szCs w:val="21"/>
         </w:rPr>
-        <w:t xml:space="preserve">1. ¿Qué valor devuelve digitalRead() cuando el pulsador está pulsado? ¿Y cuando no lo está?</w:t>
+        <w:t xml:space="preserve">1. ¿Qué diferencia hay entre usar solo IF y usar IF-ELSE? ¿Qué pasaba en S01 cuando soltabas el botón?</w:t>
       </w:r>
     </w:p>
     <w:tbl>
@@ -629,6 +629,38 @@
           </w:p>
         </w:tc>
       </w:tr>
+      <w:tr>
+        <w:tc>
+          <w:tcPr>
+            <w:tcW w:type="dxa" w:w="9638"/>
+            <w:tcBorders>
+              <w:top w:val="none" w:color="FFFFFF" w:sz="0"/>
+              <w:left w:val="none" w:color="FFFFFF" w:sz="0"/>
+              <w:bottom w:val="single" w:color="CCCCCC" w:sz="1"/>
+              <w:right w:val="none" w:color="FFFFFF" w:sz="0"/>
+            </w:tcBorders>
+            <w:tcMar>
+              <w:top w:type="dxa" w:w="0"/>
+              <w:left w:type="dxa" w:w="120"/>
+              <w:bottom w:type="dxa" w:w="0"/>
+              <w:right w:type="dxa" w:w="120"/>
+            </w:tcMar>
+          </w:tcPr>
+          <w:p>
+            <w:pPr>
+              <w:spacing w:after="200" w:before="0"/>
+            </w:pPr>
+            <w:r>
+              <w:rPr>
+                <w:rFonts w:ascii="Arial" w:cs="Arial" w:eastAsia="Arial" w:hAnsi="Arial"/>
+                <w:sz w:val="22"/>
+                <w:szCs w:val="22"/>
+              </w:rPr>
+              <w:t xml:space="preserve"/>
+            </w:r>
+          </w:p>
+        </w:tc>
+      </w:tr>
     </w:tbl>
     <w:p>
       <w:pPr>
@@ -648,7 +680,7 @@
           <w:sz w:val="21"/>
           <w:szCs w:val="21"/>
         </w:rPr>
-        <w:t xml:space="preserve">2. ¿Para qué sirve la resistencia pull-down de 10 kΩ? ¿Qué pasaría sin ella?</w:t>
+        <w:t xml:space="preserve">2. ¿Por qué es imprescindible la resistencia pull-down en este circuito?</w:t>
       </w:r>
     </w:p>
     <w:tbl>
@@ -730,38 +762,6 @@
           </w:p>
         </w:tc>
       </w:tr>
-      <w:tr>
-        <w:tc>
-          <w:tcPr>
-            <w:tcW w:type="dxa" w:w="9638"/>
-            <w:tcBorders>
-              <w:top w:val="none" w:color="FFFFFF" w:sz="0"/>
-              <w:left w:val="none" w:color="FFFFFF" w:sz="0"/>
-              <w:bottom w:val="single" w:color="CCCCCC" w:sz="1"/>
-              <w:right w:val="none" w:color="FFFFFF" w:sz="0"/>
-            </w:tcBorders>
-            <w:tcMar>
-              <w:top w:type="dxa" w:w="0"/>
-              <w:left w:type="dxa" w:w="120"/>
-              <w:bottom w:type="dxa" w:w="0"/>
-              <w:right w:type="dxa" w:w="120"/>
-            </w:tcMar>
-          </w:tcPr>
-          <w:p>
-            <w:pPr>
-              <w:spacing w:after="200" w:before="0"/>
-            </w:pPr>
-            <w:r>
-              <w:rPr>
-                <w:rFonts w:ascii="Arial" w:cs="Arial" w:eastAsia="Arial" w:hAnsi="Arial"/>
-                <w:sz w:val="22"/>
-                <w:szCs w:val="22"/>
-              </w:rPr>
-              <w:t xml:space="preserve"/>
-            </w:r>
-          </w:p>
-        </w:tc>
-      </w:tr>
     </w:tbl>
     <w:p>
       <w:pPr>
@@ -841,7 +841,7 @@
           <w:sz w:val="22"/>
           <w:szCs w:val="22"/>
         </w:rPr>
-        <w:t xml:space="preserve">Completa la tabla antes de montar el circuito:</w:t>
+        <w:t xml:space="preserve">El circuito es el mismo que S01. Completa la tabla antes de programar:</w:t>
       </w:r>
     </w:p>
     <w:p>
@@ -1295,7 +1295,7 @@
                 <w:sz w:val="20"/>
                 <w:szCs w:val="20"/>
               </w:rPr>
-              <w:t xml:space="preserve">🔀 Condición del IF</w:t>
+              <w:t xml:space="preserve">✅ Rama IF (condición verdad)</w:t>
             </w:r>
           </w:p>
         </w:tc>
@@ -1361,7 +1361,7 @@
                 <w:sz w:val="20"/>
                 <w:szCs w:val="20"/>
               </w:rPr>
-              <w:t xml:space="preserve">✅ Acción si verdad</w:t>
+              <w:t xml:space="preserve">❌ Rama ELSE (condición falsa)</w:t>
             </w:r>
           </w:p>
         </w:tc>
@@ -1475,7 +1475,7 @@
           <w:sz w:val="22"/>
           <w:szCs w:val="22"/>
         </w:rPr>
-        <w:t xml:space="preserve">Monta el circuito (pulsador pin 7 con pull-down 10 kΩ + LED pin 13 con 220 Ω) y escribe este código:</w:t>
+        <w:t xml:space="preserve">Monta el circuito (mismo que S01) y escribe el programa IF-ELSE completo:</w:t>
       </w:r>
     </w:p>
     <w:p>
@@ -1637,7 +1637,29 @@
                 <w:sz w:val="19"/>
                 <w:szCs w:val="19"/>
               </w:rPr>
-              <w:t xml:space="preserve">        digitalWrite(pinLed, HIGH);</w:t>
+              <w:t xml:space="preserve">        digitalWrite(pinLed, HIGH);  // pulsado → LED ON</w:t>
+            </w:r>
+          </w:p>
+          <w:p>
+            <w:r>
+              <w:rPr>
+                <w:rFonts w:ascii="Courier New" w:cs="Courier New" w:eastAsia="Courier New" w:hAnsi="Courier New"/>
+                <w:color w:val="2A5A2A"/>
+                <w:sz w:val="19"/>
+                <w:szCs w:val="19"/>
+              </w:rPr>
+              <w:t xml:space="preserve">    } else {</w:t>
+            </w:r>
+          </w:p>
+          <w:p>
+            <w:r>
+              <w:rPr>
+                <w:rFonts w:ascii="Courier New" w:cs="Courier New" w:eastAsia="Courier New" w:hAnsi="Courier New"/>
+                <w:color w:val="2A5A2A"/>
+                <w:sz w:val="19"/>
+                <w:szCs w:val="19"/>
+              </w:rPr>
+              <w:t xml:space="preserve">        digitalWrite(pinLed, LOW);   // suelto  → LED OFF</w:t>
             </w:r>
           </w:p>
           <w:p>
@@ -1684,7 +1706,7 @@
           <w:sz w:val="22"/>
           <w:szCs w:val="22"/>
         </w:rPr>
-        <w:t xml:space="preserve">Simula el circuito, comprueba que funciona y pega el enlace aquí:</w:t>
+        <w:t xml:space="preserve">Simula, comprueba los dos casos y pega el enlace aquí:</w:t>
       </w:r>
     </w:p>
     <w:p>
@@ -1849,7 +1871,7 @@
           <w:sz w:val="22"/>
           <w:szCs w:val="22"/>
         </w:rPr>
-        <w:t xml:space="preserve">El LED enciende al pulsar pero no se apaga al soltar. Añade la rama ELSE para que el LED se apague cuando el botón esté en LOW. Adelántate a S03 e investiga la sintaxis if-else en Arduino.</w:t>
+        <w:t xml:space="preserve">El LED ahora refleja el estado del botón en tiempo real. ¿Puedes hacer que en lugar de encenderse instantáneamente, el LED parpadee 3 veces rápido antes de quedarse encendido? Y cuando sueltes, ¿puede apagarse con un destello lento? Necesitarás delay() dentro de las ramas del IF-ELSE.</w:t>
       </w:r>
     </w:p>
     <w:p>
@@ -1923,6 +1945,83 @@
                 <w:sz w:val="19"/>
                 <w:szCs w:val="19"/>
               </w:rPr>
+              <w:t xml:space="preserve">        // 3 parpadeos rápidos antes de quedarse encendido</w:t>
+            </w:r>
+          </w:p>
+          <w:p>
+            <w:r>
+              <w:rPr>
+                <w:rFonts w:ascii="Courier New" w:cs="Courier New" w:eastAsia="Courier New" w:hAnsi="Courier New"/>
+                <w:color w:val="312E81"/>
+                <w:sz w:val="19"/>
+                <w:szCs w:val="19"/>
+              </w:rPr>
+              <w:t xml:space="preserve">        for (int i = 0; i &lt; 3; i++) {</w:t>
+            </w:r>
+          </w:p>
+          <w:p>
+            <w:r>
+              <w:rPr>
+                <w:rFonts w:ascii="Courier New" w:cs="Courier New" w:eastAsia="Courier New" w:hAnsi="Courier New"/>
+                <w:color w:val="312E81"/>
+                <w:sz w:val="19"/>
+                <w:szCs w:val="19"/>
+              </w:rPr>
+              <w:t xml:space="preserve">            digitalWrite(pinLed, HIGH);</w:t>
+            </w:r>
+          </w:p>
+          <w:p>
+            <w:r>
+              <w:rPr>
+                <w:rFonts w:ascii="Courier New" w:cs="Courier New" w:eastAsia="Courier New" w:hAnsi="Courier New"/>
+                <w:color w:val="312E81"/>
+                <w:sz w:val="19"/>
+                <w:szCs w:val="19"/>
+              </w:rPr>
+              <w:t xml:space="preserve">            delay(80);</w:t>
+            </w:r>
+          </w:p>
+          <w:p>
+            <w:r>
+              <w:rPr>
+                <w:rFonts w:ascii="Courier New" w:cs="Courier New" w:eastAsia="Courier New" w:hAnsi="Courier New"/>
+                <w:color w:val="312E81"/>
+                <w:sz w:val="19"/>
+                <w:szCs w:val="19"/>
+              </w:rPr>
+              <w:t xml:space="preserve">            digitalWrite(pinLed, LOW);</w:t>
+            </w:r>
+          </w:p>
+          <w:p>
+            <w:r>
+              <w:rPr>
+                <w:rFonts w:ascii="Courier New" w:cs="Courier New" w:eastAsia="Courier New" w:hAnsi="Courier New"/>
+                <w:color w:val="312E81"/>
+                <w:sz w:val="19"/>
+                <w:szCs w:val="19"/>
+              </w:rPr>
+              <w:t xml:space="preserve">            delay(80);</w:t>
+            </w:r>
+          </w:p>
+          <w:p>
+            <w:r>
+              <w:rPr>
+                <w:rFonts w:ascii="Courier New" w:cs="Courier New" w:eastAsia="Courier New" w:hAnsi="Courier New"/>
+                <w:color w:val="312E81"/>
+                <w:sz w:val="19"/>
+                <w:szCs w:val="19"/>
+              </w:rPr>
+              <w:t xml:space="preserve">        }</w:t>
+            </w:r>
+          </w:p>
+          <w:p>
+            <w:r>
+              <w:rPr>
+                <w:rFonts w:ascii="Courier New" w:cs="Courier New" w:eastAsia="Courier New" w:hAnsi="Courier New"/>
+                <w:color w:val="312E81"/>
+                <w:sz w:val="19"/>
+                <w:szCs w:val="19"/>
+              </w:rPr>
               <w:t xml:space="preserve">        digitalWrite(pinLed, HIGH);</w:t>
             </w:r>
           </w:p>
@@ -1945,7 +2044,7 @@
                 <w:sz w:val="19"/>
                 <w:szCs w:val="19"/>
               </w:rPr>
-              <w:t xml:space="preserve">        // ¿Qué pondrías aquí para apagar el LED?</w:t>
+              <w:t xml:space="preserve">        // apagado con destello lento</w:t>
             </w:r>
           </w:p>
           <w:p>
@@ -1956,7 +2055,29 @@
                 <w:sz w:val="19"/>
                 <w:szCs w:val="19"/>
               </w:rPr>
-              <w:t xml:space="preserve">        digitalWrite(pinLed, ???);</w:t>
+              <w:t xml:space="preserve">        digitalWrite(pinLed, HIGH);</w:t>
+            </w:r>
+          </w:p>
+          <w:p>
+            <w:r>
+              <w:rPr>
+                <w:rFonts w:ascii="Courier New" w:cs="Courier New" w:eastAsia="Courier New" w:hAnsi="Courier New"/>
+                <w:color w:val="312E81"/>
+                <w:sz w:val="19"/>
+                <w:szCs w:val="19"/>
+              </w:rPr>
+              <w:t xml:space="preserve">        delay(300);</w:t>
+            </w:r>
+          </w:p>
+          <w:p>
+            <w:r>
+              <w:rPr>
+                <w:rFonts w:ascii="Courier New" w:cs="Courier New" w:eastAsia="Courier New" w:hAnsi="Courier New"/>
+                <w:color w:val="312E81"/>
+                <w:sz w:val="19"/>
+                <w:szCs w:val="19"/>
+              </w:rPr>
+              <w:t xml:space="preserve">        digitalWrite(pinLed, LOW);</w:t>
             </w:r>
           </w:p>
           <w:p>

</xml_diff>

<commit_message>
Corregir ampliación S02 2ESO: enunciado y solución de parpadeo
</commit_message>
<xml_diff>
--- a/2ESO/S02-el-boton-de-la-verdad/ficha-reto.docx
+++ b/2ESO/S02-el-boton-de-la-verdad/ficha-reto.docx
@@ -1763,7 +1763,7 @@
                 <w:sz w:val="22"/>
                 <w:szCs w:val="22"/>
               </w:rPr>
-              <w:t xml:space="preserve">🟣  Enlace de entrega — pega aquí el enlace de tu proyecto:</w:t>
+              <w:t xml:space="preserve">🟣  Enlace de entrega — pega aquí el enlace de tu proyecto en Tinkercad:</w:t>
             </w:r>
           </w:p>
           <w:p>
@@ -1871,7 +1871,7 @@
           <w:sz w:val="22"/>
           <w:szCs w:val="22"/>
         </w:rPr>
-        <w:t xml:space="preserve">¿Puedes hacer que al pulsar el botón el LED no se encienda directamente, sino que parpadee tres veces rápido antes de quedarse encendido? Y al soltar, que se apague con un destello lento en lugar de apagarse de golpe.</w:t>
+        <w:t xml:space="preserve">¿Puedes hacer que cuando el botón esté pulsado, el LED no se quede simplemente encendido sino que parpadee rápidamente sin parar (mientras lo mantengas pulsado)? Y cuando sueltes el botón, el LED se queda apagado fijo (sin parpadeos). Es decir: pulsado = parpadeo continuo; suelto = apagado.</w:t>
       </w:r>
     </w:p>
     <w:p>
@@ -1942,7 +1942,7 @@
                 <w:sz w:val="20"/>
                 <w:szCs w:val="20"/>
               </w:rPr>
-              <w:t xml:space="preserve">Tendrás que añadir instrucciones dentro de cada rama del IF-ELSE. Recuerda que delay() detiene el programa: si lo pones dentro del loop, el Arduino no puede leer el botón mientras espera. Prueba primero solo la rama del IF y cuando funcione añade la del ELSE.</w:t>
+              <w:t xml:space="preserve">Dentro de la rama IF (botón pulsado), el LED debe encenderse, esperar un poco, apagarse y esperar otro poco. Como el loop() se ejecuta una y otra vez, mientras tengas el botón pulsado seguirá repitiéndose ese patrón. Prueba con delays de unos 100 ms para que el parpadeo sea bien visible.</w:t>
             </w:r>
           </w:p>
         </w:tc>

</xml_diff>